<commit_message>
Amend build guide + bundle offline firmware
Guide: add NeoPixel front/back figure (Din/Dout wiring), switch online install to the drag-into-Terminal method (folder-name/location agnostic), and replace the broken pio-cache offline method with the working esptool + pre-built-binary steps. Add firmware/ (merged binary + parts), OFFLINE_INSTRUCTIONS.md, and the NeoPixel illustration — one bundle now covers both online and offline builds.

Co-Authored-By: Claude Opus 4.8 <noreply@anthropic.com>
</commit_message>
<xml_diff>
--- a/RTNode2400_Build_Guide.docx
+++ b/RTNode2400_Build_Guide.docx
@@ -558,7 +558,7 @@
           <w:sz w:val="22"/>
           <w:szCs w:val="22"/>
         </w:rPr>
-        <w:t xml:space="preserve">Make sure the folder you were given (containing this guide and setup_rtnode2400.sh) is on your Desktop. Then copy and paste this into Terminal and press Enter:</w:t>
+        <w:t xml:space="preserve">Make sure you’ve unzipped the folder you were given (it has this guide and a file called setup_rtnode2400.sh inside it). Then in Terminal, type bash and a space, drag the setup_rtnode2400.sh file into the Terminal window — that fills in its exact location for you — and press Enter. The finished line looks something like this:</w:t>
       </w:r>
     </w:p>
     <w:p>
@@ -579,7 +579,7 @@
           <w:sz w:val="20"/>
           <w:szCs w:val="20"/>
         </w:rPr>
-        <w:t xml:space="preserve">bash ~/Desktop/"RTNode2400 Setup/setup_rtnode2400.sh"</w:t>
+        <w:t xml:space="preserve">bash ~/Downloads/Easy-Reticulum-Transport-Node-Build/setup_rtnode2400.sh</w:t>
       </w:r>
     </w:p>
     <w:p>
@@ -600,7 +600,7 @@
           <w:sz w:val="20"/>
           <w:szCs w:val="20"/>
         </w:rPr>
-        <w:t xml:space="preserve">Note: If your folder has a different name, replace “RTNode2400 Setup” above with the actual folder name.</w:t>
+        <w:t xml:space="preserve">Note: Dragging the file in means you don’t have to worry about what the folder is called or where it sits — Terminal fills in the correct location automatically. (You just need to have unzipped it first.)</w:t>
       </w:r>
     </w:p>
     <w:p>
@@ -843,6 +843,49 @@
           <w:szCs w:val="22"/>
         </w:rPr>
         <w:t xml:space="preserve">If you have a WS2812B/NeoPixel LED, you can wire it up to see the board's activity as it happens:</w:t>
+      </w:r>
+    </w:p>
+    <w:p>
+      <w:pPr>
+        <w:jc w:val="center"/>
+        <w:spacing w:before="160" w:after="160"/>
+      </w:pPr>
+      <w:r>
+        <w:drawing>
+          <wp:inline distT="0" distB="0" distL="0" distR="0">
+            <wp:extent cx="5486400" cy="3621024"/>
+            <wp:effectExtent l="0" t="0" r="0" b="0"/>
+            <wp:docPr id="1008" name="NeoPixel front and back"/>
+            <wp:cNvGraphicFramePr>
+              <a:graphicFrameLocks xmlns:a="http://schemas.openxmlformats.org/drawingml/2006/main" noChangeAspect="1"/>
+            </wp:cNvGraphicFramePr>
+            <a:graphic xmlns:a="http://schemas.openxmlformats.org/drawingml/2006/main">
+              <a:graphicData uri="http://schemas.openxmlformats.org/drawingml/2006/picture">
+                <pic:pic xmlns:pic="http://schemas.openxmlformats.org/drawingml/2006/picture">
+                  <pic:nvPicPr>
+                    <pic:cNvPr id="1008" name="NeoPixel front and back"/>
+                    <pic:cNvPicPr/>
+                  </pic:nvPicPr>
+                  <pic:blipFill>
+                    <a:blip r:embed="rId17"/>
+                    <a:stretch>
+                      <a:fillRect/>
+                    </a:stretch>
+                  </pic:blipFill>
+                  <pic:spPr>
+                    <a:xfrm>
+                      <a:off x="0" y="0"/>
+                      <a:ext cx="5486400" cy="3621024"/>
+                    </a:xfrm>
+                    <a:prstGeom prst="rect">
+                      <a:avLst/>
+                    </a:prstGeom>
+                  </pic:spPr>
+                </pic:pic>
+              </a:graphicData>
+            </a:graphic>
+          </wp:inline>
+        </w:drawing>
       </w:r>
     </w:p>
     <w:p>
@@ -3645,7 +3688,7 @@
           <w:sz w:val="32"/>
           <w:szCs w:val="32"/>
         </w:rPr>
-        <w:t xml:space="preserve">No Internet Access? Do This Instead</w:t>
+        <w:t xml:space="preserve">No Internet? Just Flash the Ready-Made Firmware</w:t>
       </w:r>
     </w:p>
     <w:p>
@@ -3659,7 +3702,49 @@
           <w:sz w:val="22"/>
           <w:szCs w:val="22"/>
         </w:rPr>
-        <w:t xml:space="preserve">The one-step setup script needs the internet twice: once to download some one-time tools, and once to download the firmware code and the chip toolchain it builds with. If the computer you're setting this up on doesn't have internet access, here's how to do it without any:</w:t>
+        <w:t xml:space="preserve">Use this if the computer you’re on has no internet, or you simply don’t want to build the firmware yourself. Your folder already contains a ready-made firmware file — you flash it straight onto the board, with no building and almost no internet.</w:t>
+      </w:r>
+    </w:p>
+    <w:p>
+      <w:pPr>
+        <w:pBdr>
+          <w:left w:val="single" w:color="b5651d" w:sz="18" w:space="8"/>
+        </w:pBdr>
+        <w:shd w:fill="fdf1e0" w:val="clear"/>
+        <w:spacing w:after="200" w:before="120"/>
+        <w:ind w:left="360"/>
+      </w:pPr>
+      <w:r>
+        <w:rPr>
+          <w:rFonts w:ascii="Calibri" w:cs="Calibri" w:eastAsia="Calibri" w:hAnsi="Calibri"/>
+          <w:i/>
+          <w:iCs/>
+          <w:color w:val="6b4c1f"/>
+          <w:sz w:val="20"/>
+          <w:szCs w:val="20"/>
+        </w:rPr>
+        <w:t xml:space="preserve">Note: What “offline” means here — no downloading the source code, no builder, and no big toolchain. The only thing you have to fetch is one small tool called esptool (a few megabytes), just once. If you’ve used the Arduino app or any ESP32 tools before, you probably already have it.</w:t>
+      </w:r>
+    </w:p>
+    <w:p>
+      <w:pPr>
+        <w:pBdr>
+          <w:left w:val="single" w:color="b5651d" w:sz="18" w:space="8"/>
+        </w:pBdr>
+        <w:shd w:fill="fdf1e0" w:val="clear"/>
+        <w:spacing w:after="200" w:before="120"/>
+        <w:ind w:left="360"/>
+      </w:pPr>
+      <w:r>
+        <w:rPr>
+          <w:rFonts w:ascii="Calibri" w:cs="Calibri" w:eastAsia="Calibri" w:hAnsi="Calibri"/>
+          <w:i/>
+          <w:iCs/>
+          <w:color w:val="6b4c1f"/>
+          <w:sz w:val="20"/>
+          <w:szCs w:val="20"/>
+        </w:rPr>
+        <w:t xml:space="preserve">Note: Don’t double-click the .bin files. They’re firmware images, not zip files — on a Mac they show an archive-style icon, so double-clicking opens Archive Utility and you’ll see “Unable to expand… unsupported format.” That’s completely normal, just ignore it. Leave every file in the firmware folder exactly as it is; the command below reads the file directly.</w:t>
       </w:r>
     </w:p>
     <w:p>
@@ -3675,137 +3760,21 @@
           <w:sz w:val="26"/>
           <w:szCs w:val="26"/>
         </w:rPr>
-        <w:t xml:space="preserve">First (on a computer that does have internet)</w:t>
-      </w:r>
-    </w:p>
-    <w:p>
-      <w:pPr>
-        <w:pStyle w:val="ListParagraph"/>
-        <w:numPr>
-          <w:ilvl w:val="0"/>
-          <w:numId w:val="3"/>
-        </w:numPr>
-        <w:spacing w:after="100"/>
-      </w:pPr>
-      <w:r>
-        <w:rPr>
-          <w:rFonts w:ascii="Calibri" w:cs="Calibri" w:eastAsia="Calibri" w:hAnsi="Calibri"/>
-          <w:color w:val="444444"/>
-          <w:sz w:val="22"/>
-          <w:szCs w:val="22"/>
-        </w:rPr>
-        <w:t xml:space="preserve">Run the normal Quick Setup steps once, all the way through, on any computer that has internet — doesn't have to be the same one you'll use offline.</w:t>
-      </w:r>
-    </w:p>
-    <w:p>
-      <w:pPr>
-        <w:pStyle w:val="ListParagraph"/>
-        <w:numPr>
-          <w:ilvl w:val="0"/>
-          <w:numId w:val="3"/>
-        </w:numPr>
-        <w:spacing w:after="100"/>
-      </w:pPr>
-      <w:r>
-        <w:rPr>
-          <w:rFonts w:ascii="Calibri" w:cs="Calibri" w:eastAsia="Calibri" w:hAnsi="Calibri"/>
-          <w:color w:val="444444"/>
-          <w:sz w:val="22"/>
-          <w:szCs w:val="22"/>
-        </w:rPr>
-        <w:t xml:space="preserve">That computer now has everything cached locally. Copy these two folders onto a USB drive:</w:t>
-      </w:r>
-    </w:p>
-    <w:p>
-      <w:pPr>
-        <w:pStyle w:val="ListParagraph"/>
-        <w:numPr>
-          <w:ilvl w:val="1"/>
-          <w:numId w:val="2"/>
-        </w:numPr>
-        <w:spacing w:after="80"/>
-      </w:pPr>
-      <w:r>
-        <w:rPr>
-          <w:rFonts w:ascii="Calibri" w:cs="Calibri" w:eastAsia="Calibri" w:hAnsi="Calibri"/>
-          <w:color w:val="444444"/>
-          <w:sz w:val="22"/>
-          <w:szCs w:val="22"/>
-        </w:rPr>
-        <w:t xml:space="preserve">The RTNode2400 folder from the Desktop</w:t>
-      </w:r>
-    </w:p>
-    <w:p>
-      <w:pPr>
-        <w:pStyle w:val="ListParagraph"/>
-        <w:numPr>
-          <w:ilvl w:val="1"/>
-          <w:numId w:val="2"/>
-        </w:numPr>
-        <w:spacing w:after="80"/>
-      </w:pPr>
-      <w:r>
-        <w:rPr>
-          <w:rFonts w:ascii="Calibri" w:cs="Calibri" w:eastAsia="Calibri" w:hAnsi="Calibri"/>
-          <w:color w:val="444444"/>
-          <w:sz w:val="22"/>
-          <w:szCs w:val="22"/>
-        </w:rPr>
-        <w:t xml:space="preserve">The hidden .platformio folder from the Home folder (this holds the downloaded chip toolchain — it's hidden, so in Finder press Command+Shift+. to reveal hidden files/folders if you can't see it)</w:t>
-      </w:r>
-    </w:p>
-    <w:p>
-      <w:pPr>
-        <w:spacing w:after="120" w:before="320"/>
-      </w:pPr>
-      <w:r>
-        <w:rPr>
-          <w:rFonts w:ascii="Calibri" w:cs="Calibri" w:eastAsia="Calibri" w:hAnsi="Calibri"/>
-          <w:b/>
-          <w:bCs/>
-          <w:color w:val="1b7a72"/>
-          <w:sz w:val="26"/>
-          <w:szCs w:val="26"/>
-        </w:rPr>
-        <w:t xml:space="preserve">Then (on the offline computer)</w:t>
-      </w:r>
-    </w:p>
-    <w:p>
-      <w:pPr>
-        <w:pStyle w:val="ListParagraph"/>
-        <w:numPr>
-          <w:ilvl w:val="0"/>
-          <w:numId w:val="3"/>
-        </w:numPr>
-        <w:spacing w:after="100"/>
-      </w:pPr>
-      <w:r>
-        <w:rPr>
-          <w:rFonts w:ascii="Calibri" w:cs="Calibri" w:eastAsia="Calibri" w:hAnsi="Calibri"/>
-          <w:color w:val="444444"/>
-          <w:sz w:val="22"/>
-          <w:szCs w:val="22"/>
-        </w:rPr>
-        <w:t xml:space="preserve">Copy both folders from the USB drive onto the offline computer, in the exact same places: RTNode2400 onto the Desktop, and .platformio into the Home folder.</w:t>
-      </w:r>
-    </w:p>
-    <w:p>
-      <w:pPr>
-        <w:pStyle w:val="ListParagraph"/>
-        <w:numPr>
-          <w:ilvl w:val="0"/>
-          <w:numId w:val="3"/>
-        </w:numPr>
-        <w:spacing w:after="100"/>
-      </w:pPr>
-      <w:r>
-        <w:rPr>
-          <w:rFonts w:ascii="Calibri" w:cs="Calibri" w:eastAsia="Calibri" w:hAnsi="Calibri"/>
-          <w:color w:val="444444"/>
-          <w:sz w:val="22"/>
-          <w:szCs w:val="22"/>
-        </w:rPr>
-        <w:t xml:space="preserve">Open Terminal and run:</w:t>
+        <w:t xml:space="preserve">Step 1: Install esptool (one time)</w:t>
+      </w:r>
+    </w:p>
+    <w:p>
+      <w:pPr>
+        <w:spacing w:after="160"/>
+      </w:pPr>
+      <w:r>
+        <w:rPr>
+          <w:rFonts w:ascii="Calibri" w:cs="Calibri" w:eastAsia="Calibri" w:hAnsi="Calibri"/>
+          <w:color w:val="444444"/>
+          <w:sz w:val="22"/>
+          <w:szCs w:val="22"/>
+        </w:rPr>
+        <w:t xml:space="preserve">You’ll need Python 3 (Macs already have it; on Windows, install it from python.org and tick “Add Python to PATH”). Then, in Terminal, run:</w:t>
       </w:r>
     </w:p>
     <w:p>
@@ -3826,26 +3795,81 @@
           <w:sz w:val="20"/>
           <w:szCs w:val="20"/>
         </w:rPr>
-        <w:t xml:space="preserve">cd ~/Desktop/RTNode2400</w:t>
-      </w:r>
-    </w:p>
-    <w:p>
-      <w:pPr>
-        <w:pStyle w:val="ListParagraph"/>
-        <w:numPr>
-          <w:ilvl w:val="0"/>
-          <w:numId w:val="3"/>
-        </w:numPr>
-        <w:spacing w:after="100"/>
-      </w:pPr>
-      <w:r>
-        <w:rPr>
-          <w:rFonts w:ascii="Calibri" w:cs="Calibri" w:eastAsia="Calibri" w:hAnsi="Calibri"/>
-          <w:color w:val="444444"/>
-          <w:sz w:val="22"/>
-          <w:szCs w:val="22"/>
-        </w:rPr>
-        <w:t xml:space="preserve">Plug in the Heltec V4 board via USB-C, then find its port:</w:t>
+        <w:t xml:space="preserve">pip install esptool</w:t>
+      </w:r>
+    </w:p>
+    <w:p>
+      <w:pPr>
+        <w:spacing w:after="160"/>
+      </w:pPr>
+      <w:r>
+        <w:rPr>
+          <w:rFonts w:ascii="Calibri" w:cs="Calibri" w:eastAsia="Calibri" w:hAnsi="Calibri"/>
+          <w:color w:val="444444"/>
+          <w:sz w:val="22"/>
+          <w:szCs w:val="22"/>
+        </w:rPr>
+        <w:t xml:space="preserve">If it says pip isn’t found, try pip3 install esptool instead.</w:t>
+      </w:r>
+    </w:p>
+    <w:p>
+      <w:pPr>
+        <w:spacing w:after="120" w:before="320"/>
+      </w:pPr>
+      <w:r>
+        <w:rPr>
+          <w:rFonts w:ascii="Calibri" w:cs="Calibri" w:eastAsia="Calibri" w:hAnsi="Calibri"/>
+          <w:b/>
+          <w:bCs/>
+          <w:color w:val="1b7a72"/>
+          <w:sz w:val="26"/>
+          <w:szCs w:val="26"/>
+        </w:rPr>
+        <w:t xml:space="preserve">Step 2: Plug in the board</w:t>
+      </w:r>
+    </w:p>
+    <w:p>
+      <w:pPr>
+        <w:spacing w:after="160"/>
+      </w:pPr>
+      <w:r>
+        <w:rPr>
+          <w:rFonts w:ascii="Calibri" w:cs="Calibri" w:eastAsia="Calibri" w:hAnsi="Calibri"/>
+          <w:color w:val="444444"/>
+          <w:sz w:val="22"/>
+          <w:szCs w:val="22"/>
+        </w:rPr>
+        <w:t xml:space="preserve">Connect the Heltec V4 with a USB-C data cable (not a charge-only one).</w:t>
+      </w:r>
+    </w:p>
+    <w:p>
+      <w:pPr>
+        <w:spacing w:after="120" w:before="320"/>
+      </w:pPr>
+      <w:r>
+        <w:rPr>
+          <w:rFonts w:ascii="Calibri" w:cs="Calibri" w:eastAsia="Calibri" w:hAnsi="Calibri"/>
+          <w:b/>
+          <w:bCs/>
+          <w:color w:val="1b7a72"/>
+          <w:sz w:val="26"/>
+          <w:szCs w:val="26"/>
+        </w:rPr>
+        <w:t xml:space="preserve">Step 3: Find the board’s port</w:t>
+      </w:r>
+    </w:p>
+    <w:p>
+      <w:pPr>
+        <w:spacing w:after="160"/>
+      </w:pPr>
+      <w:r>
+        <w:rPr>
+          <w:rFonts w:ascii="Calibri" w:cs="Calibri" w:eastAsia="Calibri" w:hAnsi="Calibri"/>
+          <w:color w:val="444444"/>
+          <w:sz w:val="22"/>
+          <w:szCs w:val="22"/>
+        </w:rPr>
+        <w:t xml:space="preserve">In Terminal, run this to see the board’s connection name:</w:t>
       </w:r>
     </w:p>
     <w:p>
@@ -3866,7 +3890,7 @@
           <w:sz w:val="20"/>
           <w:szCs w:val="20"/>
         </w:rPr>
-        <w:t xml:space="preserve">ls /dev/cu.*</w:t>
+        <w:t xml:space="preserve">ls /dev/cu.usbmodem*</w:t>
       </w:r>
     </w:p>
     <w:p>
@@ -3880,26 +3904,37 @@
           <w:sz w:val="22"/>
           <w:szCs w:val="22"/>
         </w:rPr>
-        <w:t xml:space="preserve">Look for something like /dev/cu.usbmodemXXXX (ignore Bluetooth and debug-console entries).</w:t>
-      </w:r>
-    </w:p>
-    <w:p>
-      <w:pPr>
-        <w:pStyle w:val="ListParagraph"/>
-        <w:numPr>
-          <w:ilvl w:val="0"/>
-          <w:numId w:val="3"/>
-        </w:numPr>
-        <w:spacing w:after="100"/>
-      </w:pPr>
-      <w:r>
-        <w:rPr>
-          <w:rFonts w:ascii="Calibri" w:cs="Calibri" w:eastAsia="Calibri" w:hAnsi="Calibri"/>
-          <w:color w:val="444444"/>
-          <w:sz w:val="22"/>
-          <w:szCs w:val="22"/>
-        </w:rPr>
-        <w:t xml:space="preserve">Flash the board — replace YOUR_PORT with what you just found:</w:t>
+        <w:t xml:space="preserve">You’ll get something like /dev/cu.usbmodem2101. (On Windows: Device Manager → Ports → note the COM number. On Linux: ls /dev/ttyUSB* /dev/ttyACM*.)</w:t>
+      </w:r>
+    </w:p>
+    <w:p>
+      <w:pPr>
+        <w:spacing w:after="120" w:before="320"/>
+      </w:pPr>
+      <w:r>
+        <w:rPr>
+          <w:rFonts w:ascii="Calibri" w:cs="Calibri" w:eastAsia="Calibri" w:hAnsi="Calibri"/>
+          <w:b/>
+          <w:bCs/>
+          <w:color w:val="1b7a72"/>
+          <w:sz w:val="26"/>
+          <w:szCs w:val="26"/>
+        </w:rPr>
+        <w:t xml:space="preserve">Step 4: Point Terminal at the folder</w:t>
+      </w:r>
+    </w:p>
+    <w:p>
+      <w:pPr>
+        <w:spacing w:after="160"/>
+      </w:pPr>
+      <w:r>
+        <w:rPr>
+          <w:rFonts w:ascii="Calibri" w:cs="Calibri" w:eastAsia="Calibri" w:hAnsi="Calibri"/>
+          <w:color w:val="444444"/>
+          <w:sz w:val="22"/>
+          <w:szCs w:val="22"/>
+        </w:rPr>
+        <w:t xml:space="preserve">The flash command looks inside a firmware folder, so Terminal needs to be in your unzipped folder first. Type cd and a space, then drag the whole unzipped folder into the Terminal window (that fills in its location for you), and press Enter:</w:t>
       </w:r>
     </w:p>
     <w:p>
@@ -3920,7 +3955,23 @@
           <w:sz w:val="20"/>
           <w:szCs w:val="20"/>
         </w:rPr>
-        <w:t xml:space="preserve">python3 -m platformio run -e heltec_V4_boundary-local -t upload --upload-port YOUR_PORT</w:t>
+        <w:t xml:space="preserve">cd ~/Downloads/Easy-Reticulum-Transport-Node-Build</w:t>
+      </w:r>
+    </w:p>
+    <w:p>
+      <w:pPr>
+        <w:spacing w:after="120" w:before="320"/>
+      </w:pPr>
+      <w:r>
+        <w:rPr>
+          <w:rFonts w:ascii="Calibri" w:cs="Calibri" w:eastAsia="Calibri" w:hAnsi="Calibri"/>
+          <w:b/>
+          <w:bCs/>
+          <w:color w:val="1b7a72"/>
+          <w:sz w:val="26"/>
+          <w:szCs w:val="26"/>
+        </w:rPr>
+        <w:t xml:space="preserve">Step 5: Flash it (one command)</w:t>
       </w:r>
     </w:p>
     <w:p>
@@ -3934,13 +3985,48 @@
           <w:sz w:val="22"/>
           <w:szCs w:val="22"/>
         </w:rPr>
-        <w:t xml:space="preserve">Since everything needed is already sitting in the .platformio folder you copied over, this works without touching the internet at all.</w:t>
+        <w:t xml:space="preserve">Copy the line below, replace YOUR_PORT with what you found in Step 3, and press Enter:</w:t>
       </w:r>
     </w:p>
     <w:p>
       <w:pPr>
         <w:pBdr>
-          <w:left w:val="single" w:color="b5651d" w:sz="24" w:space="8"/>
+          <w:top w:val="single" w:color="1b7a72" w:sz="4" w:space="6"/>
+          <w:bottom w:val="single" w:color="1b7a72" w:sz="4" w:space="6"/>
+          <w:left w:val="single" w:color="1b7a72" w:sz="18" w:space="6"/>
+          <w:right w:val="single" w:color="1b7a72" w:sz="4" w:space="6"/>
+        </w:pBdr>
+        <w:shd w:fill="eef6f5" w:val="clear"/>
+        <w:spacing w:after="240" w:before="100"/>
+      </w:pPr>
+      <w:r>
+        <w:rPr>
+          <w:rFonts w:ascii="Courier New" w:cs="Courier New" w:eastAsia="Courier New" w:hAnsi="Courier New"/>
+          <w:color w:val="1a1a1a"/>
+          <w:sz w:val="20"/>
+          <w:szCs w:val="20"/>
+        </w:rPr>
+        <w:t xml:space="preserve">esptool --chip esp32s3 --port YOUR_PORT --baud 921600 write_flash 0x0 firmware/rtnode2400_heltecV4_merged.bin</w:t>
+      </w:r>
+    </w:p>
+    <w:p>
+      <w:pPr>
+        <w:spacing w:after="160"/>
+      </w:pPr>
+      <w:r>
+        <w:rPr>
+          <w:rFonts w:ascii="Calibri" w:cs="Calibri" w:eastAsia="Calibri" w:hAnsi="Calibri"/>
+          <w:color w:val="444444"/>
+          <w:sz w:val="22"/>
+          <w:szCs w:val="22"/>
+        </w:rPr>
+        <w:t xml:space="preserve">You should see Writing at 0x… (100 %), then Hash of data verified. and Hard resetting… — that means it worked. (If esptool isn’t found as a command, use python3 -m esptool … instead.)</w:t>
+      </w:r>
+    </w:p>
+    <w:p>
+      <w:pPr>
+        <w:pBdr>
+          <w:left w:val="single" w:color="b5651d" w:sz="18" w:space="8"/>
         </w:pBdr>
         <w:shd w:fill="fdf1e0" w:val="clear"/>
         <w:spacing w:after="200" w:before="120"/>
@@ -3949,22 +4035,57 @@
       <w:r>
         <w:rPr>
           <w:rFonts w:ascii="Calibri" w:cs="Calibri" w:eastAsia="Calibri" w:hAnsi="Calibri"/>
-          <w:b/>
-          <w:bCs/>
-          <w:color w:val="b5651d"/>
-          <w:sz w:val="21"/>
-          <w:szCs w:val="21"/>
-        </w:rPr>
-        <w:t xml:space="preserve">One thing this can't get around: </w:t>
-      </w:r>
-      <w:r>
-        <w:rPr>
-          <w:rFonts w:ascii="Calibri" w:cs="Calibri" w:eastAsia="Calibri" w:hAnsi="Calibri"/>
+          <w:i/>
+          <w:iCs/>
           <w:color w:val="6b4c1f"/>
-          <w:sz w:val="21"/>
-          <w:szCs w:val="21"/>
-        </w:rPr>
-        <w:t xml:space="preserve">the offline computer still needs Python 3 already on it (this comes built in on most Macs) — if it's genuinely never had any developer tools installed before, getting Python 3 onto it is the one piece that still needs a brief moment of internet access somewhere, even if it's on a different computer first.</w:t>
+          <w:sz w:val="20"/>
+          <w:szCs w:val="20"/>
+        </w:rPr>
+        <w:t xml:space="preserve">Note: If it says “Failed to connect” — hold the PRG button, tap RST, release RST, then release PRG. That forces the board into “download mode.” Then run the command again. (PRG is the button next to the USB-C port.)</w:t>
+      </w:r>
+    </w:p>
+    <w:p>
+      <w:pPr>
+        <w:spacing w:after="120" w:before="320"/>
+      </w:pPr>
+      <w:r>
+        <w:rPr>
+          <w:rFonts w:ascii="Calibri" w:cs="Calibri" w:eastAsia="Calibri" w:hAnsi="Calibri"/>
+          <w:b/>
+          <w:bCs/>
+          <w:color w:val="1b7a72"/>
+          <w:sz w:val="26"/>
+          <w:szCs w:val="26"/>
+        </w:rPr>
+        <w:t xml:space="preserve">Step 6: Set it up (WiFi + name)</w:t>
+      </w:r>
+    </w:p>
+    <w:p>
+      <w:pPr>
+        <w:spacing w:after="160"/>
+      </w:pPr>
+      <w:r>
+        <w:rPr>
+          <w:rFonts w:ascii="Calibri" w:cs="Calibri" w:eastAsia="Calibri" w:hAnsi="Calibri"/>
+          <w:color w:val="444444"/>
+          <w:sz w:val="22"/>
+          <w:szCs w:val="22"/>
+        </w:rPr>
+        <w:t xml:space="preserve">Flashing only puts the firmware on the board. Now set it up exactly as in Part 3 (“Configure WiFi and LoRa Settings”) earlier in this guide: the board makes its own WiFi network called RTNode-Setup — join it, open http://10.0.0.1 in a browser, fill in the form (a name for the node, plus your home WiFi), and Save.</w:t>
+      </w:r>
+    </w:p>
+    <w:p>
+      <w:pPr>
+        <w:spacing w:after="160"/>
+      </w:pPr>
+      <w:r>
+        <w:rPr>
+          <w:rFonts w:ascii="Calibri" w:cs="Calibri" w:eastAsia="Calibri" w:hAnsi="Calibri"/>
+          <w:color w:val="444444"/>
+          <w:sz w:val="22"/>
+          <w:szCs w:val="22"/>
+        </w:rPr>
+        <w:t xml:space="preserve">Prefer to build from source instead? The full firmware isn’t bundled in the folder (it’s large), but you can get it any time from github.com/5ugAv/RTNode-2400 — or just use the one-command setup at the start of this guide, which downloads, builds and flashes it all for you.</w:t>
       </w:r>
     </w:p>
     <w:sectPr>

</xml_diff>